<commit_message>
republished book 1 to fix walsh issue
</commit_message>
<xml_diff>
--- a/Books/Book_01_The_Kestrel_Veil_Incident/Manuscript/_build/_print_manuscript.docx
+++ b/Books/Book_01_The_Kestrel_Veil_Incident/Manuscript/_build/_print_manuscript.docx
@@ -34,7 +34,7 @@
           <w:sz w:val="24"/>
           <w:szCs w:val="24"/>
         </w:rPr>
-        <w:id w:val="973638202"/>
+        <w:id w:val="-19940396"/>
         <w:docPartObj>
           <w:docPartGallery w:val="Table of Contents"/>
           <w:docPartUnique/>
@@ -74,7 +74,7 @@
           <w:r>
             <w:fldChar w:fldCharType="separate"/>
           </w:r>
-          <w:hyperlink w:anchor="_Toc234955031" w:history="1">
+          <w:hyperlink w:anchor="_Toc235544107" w:history="1">
             <w:r>
               <w:rPr>
                 <w:rStyle w:val="Hyperlink"/>
@@ -101,7 +101,7 @@
                 <w:noProof/>
                 <w:webHidden/>
               </w:rPr>
-              <w:instrText xml:space="preserve"> PAGEREF _Toc234955031 \h </w:instrText>
+              <w:instrText xml:space="preserve"> PAGEREF _Toc235544107 \h </w:instrText>
             </w:r>
             <w:r>
               <w:rPr>
@@ -142,7 +142,7 @@
               <w:noProof/>
             </w:rPr>
           </w:pPr>
-          <w:hyperlink w:anchor="_Toc234955032" w:history="1">
+          <w:hyperlink w:anchor="_Toc235544108" w:history="1">
             <w:r>
               <w:rPr>
                 <w:rStyle w:val="Hyperlink"/>
@@ -169,7 +169,7 @@
                 <w:noProof/>
                 <w:webHidden/>
               </w:rPr>
-              <w:instrText xml:space="preserve"> PAGEREF _Toc234955032 \h </w:instrText>
+              <w:instrText xml:space="preserve"> PAGEREF _Toc235544108 \h </w:instrText>
             </w:r>
             <w:r>
               <w:rPr>
@@ -210,7 +210,7 @@
               <w:noProof/>
             </w:rPr>
           </w:pPr>
-          <w:hyperlink w:anchor="_Toc234955033" w:history="1">
+          <w:hyperlink w:anchor="_Toc235544109" w:history="1">
             <w:r>
               <w:rPr>
                 <w:rStyle w:val="Hyperlink"/>
@@ -237,7 +237,7 @@
                 <w:noProof/>
                 <w:webHidden/>
               </w:rPr>
-              <w:instrText xml:space="preserve"> PAGEREF _Toc234955033 \h </w:instrText>
+              <w:instrText xml:space="preserve"> PAGEREF _Toc235544109 \h </w:instrText>
             </w:r>
             <w:r>
               <w:rPr>
@@ -278,7 +278,7 @@
               <w:noProof/>
             </w:rPr>
           </w:pPr>
-          <w:hyperlink w:anchor="_Toc234955034" w:history="1">
+          <w:hyperlink w:anchor="_Toc235544110" w:history="1">
             <w:r>
               <w:rPr>
                 <w:rStyle w:val="Hyperlink"/>
@@ -305,7 +305,7 @@
                 <w:noProof/>
                 <w:webHidden/>
               </w:rPr>
-              <w:instrText xml:space="preserve"> PAGEREF _Toc234955034 \h </w:instrText>
+              <w:instrText xml:space="preserve"> PAGEREF _Toc235544110 \h </w:instrText>
             </w:r>
             <w:r>
               <w:rPr>
@@ -346,7 +346,7 @@
               <w:noProof/>
             </w:rPr>
           </w:pPr>
-          <w:hyperlink w:anchor="_Toc234955035" w:history="1">
+          <w:hyperlink w:anchor="_Toc235544111" w:history="1">
             <w:r>
               <w:rPr>
                 <w:rStyle w:val="Hyperlink"/>
@@ -373,7 +373,7 @@
                 <w:noProof/>
                 <w:webHidden/>
               </w:rPr>
-              <w:instrText xml:space="preserve"> PAGEREF _Toc234955035 \h </w:instrText>
+              <w:instrText xml:space="preserve"> PAGEREF _Toc235544111 \h </w:instrText>
             </w:r>
             <w:r>
               <w:rPr>
@@ -414,7 +414,7 @@
               <w:noProof/>
             </w:rPr>
           </w:pPr>
-          <w:hyperlink w:anchor="_Toc234955036" w:history="1">
+          <w:hyperlink w:anchor="_Toc235544112" w:history="1">
             <w:r>
               <w:rPr>
                 <w:rStyle w:val="Hyperlink"/>
@@ -441,7 +441,7 @@
                 <w:noProof/>
                 <w:webHidden/>
               </w:rPr>
-              <w:instrText xml:space="preserve"> PAGEREF _Toc234955036 \h </w:instrText>
+              <w:instrText xml:space="preserve"> PAGEREF _Toc235544112 \h </w:instrText>
             </w:r>
             <w:r>
               <w:rPr>
@@ -482,7 +482,7 @@
               <w:noProof/>
             </w:rPr>
           </w:pPr>
-          <w:hyperlink w:anchor="_Toc234955037" w:history="1">
+          <w:hyperlink w:anchor="_Toc235544113" w:history="1">
             <w:r>
               <w:rPr>
                 <w:rStyle w:val="Hyperlink"/>
@@ -509,7 +509,7 @@
                 <w:noProof/>
                 <w:webHidden/>
               </w:rPr>
-              <w:instrText xml:space="preserve"> PAGEREF _Toc234955037 \h </w:instrText>
+              <w:instrText xml:space="preserve"> PAGEREF _Toc235544113 \h </w:instrText>
             </w:r>
             <w:r>
               <w:rPr>
@@ -550,7 +550,7 @@
               <w:noProof/>
             </w:rPr>
           </w:pPr>
-          <w:hyperlink w:anchor="_Toc234955038" w:history="1">
+          <w:hyperlink w:anchor="_Toc235544114" w:history="1">
             <w:r>
               <w:rPr>
                 <w:rStyle w:val="Hyperlink"/>
@@ -577,7 +577,7 @@
                 <w:noProof/>
                 <w:webHidden/>
               </w:rPr>
-              <w:instrText xml:space="preserve"> PAGEREF _Toc234955038 \h </w:instrText>
+              <w:instrText xml:space="preserve"> PAGEREF _Toc235544114 \h </w:instrText>
             </w:r>
             <w:r>
               <w:rPr>
@@ -618,7 +618,7 @@
               <w:noProof/>
             </w:rPr>
           </w:pPr>
-          <w:hyperlink w:anchor="_Toc234955039" w:history="1">
+          <w:hyperlink w:anchor="_Toc235544115" w:history="1">
             <w:r>
               <w:rPr>
                 <w:rStyle w:val="Hyperlink"/>
@@ -645,7 +645,7 @@
                 <w:noProof/>
                 <w:webHidden/>
               </w:rPr>
-              <w:instrText xml:space="preserve"> PAGEREF _Toc234955039 \h </w:instrText>
+              <w:instrText xml:space="preserve"> PAGEREF _Toc235544115 \h </w:instrText>
             </w:r>
             <w:r>
               <w:rPr>
@@ -686,7 +686,7 @@
               <w:noProof/>
             </w:rPr>
           </w:pPr>
-          <w:hyperlink w:anchor="_Toc234955040" w:history="1">
+          <w:hyperlink w:anchor="_Toc235544116" w:history="1">
             <w:r>
               <w:rPr>
                 <w:rStyle w:val="Hyperlink"/>
@@ -713,7 +713,7 @@
                 <w:noProof/>
                 <w:webHidden/>
               </w:rPr>
-              <w:instrText xml:space="preserve"> PAGEREF _Toc234955040 \h </w:instrText>
+              <w:instrText xml:space="preserve"> PAGEREF _Toc235544116 \h </w:instrText>
             </w:r>
             <w:r>
               <w:rPr>
@@ -754,7 +754,7 @@
               <w:noProof/>
             </w:rPr>
           </w:pPr>
-          <w:hyperlink w:anchor="_Toc234955041" w:history="1">
+          <w:hyperlink w:anchor="_Toc235544117" w:history="1">
             <w:r>
               <w:rPr>
                 <w:rStyle w:val="Hyperlink"/>
@@ -781,7 +781,7 @@
                 <w:noProof/>
                 <w:webHidden/>
               </w:rPr>
-              <w:instrText xml:space="preserve"> PAGEREF _Toc234955041 \h </w:instrText>
+              <w:instrText xml:space="preserve"> PAGEREF _Toc235544117 \h </w:instrText>
             </w:r>
             <w:r>
               <w:rPr>
@@ -822,7 +822,7 @@
               <w:noProof/>
             </w:rPr>
           </w:pPr>
-          <w:hyperlink w:anchor="_Toc234955042" w:history="1">
+          <w:hyperlink w:anchor="_Toc235544118" w:history="1">
             <w:r>
               <w:rPr>
                 <w:rStyle w:val="Hyperlink"/>
@@ -849,7 +849,7 @@
                 <w:noProof/>
                 <w:webHidden/>
               </w:rPr>
-              <w:instrText xml:space="preserve"> PAGEREF _Toc234955042 \h </w:instrText>
+              <w:instrText xml:space="preserve"> PAGEREF _Toc235544118 \h </w:instrText>
             </w:r>
             <w:r>
               <w:rPr>
@@ -890,7 +890,7 @@
               <w:noProof/>
             </w:rPr>
           </w:pPr>
-          <w:hyperlink w:anchor="_Toc234955043" w:history="1">
+          <w:hyperlink w:anchor="_Toc235544119" w:history="1">
             <w:r>
               <w:rPr>
                 <w:rStyle w:val="Hyperlink"/>
@@ -917,7 +917,7 @@
                 <w:noProof/>
                 <w:webHidden/>
               </w:rPr>
-              <w:instrText xml:space="preserve"> PAGEREF _Toc234955043 \h </w:instrText>
+              <w:instrText xml:space="preserve"> PAGEREF _Toc235544119 \h </w:instrText>
             </w:r>
             <w:r>
               <w:rPr>
@@ -958,7 +958,7 @@
               <w:noProof/>
             </w:rPr>
           </w:pPr>
-          <w:hyperlink w:anchor="_Toc234955044" w:history="1">
+          <w:hyperlink w:anchor="_Toc235544120" w:history="1">
             <w:r>
               <w:rPr>
                 <w:rStyle w:val="Hyperlink"/>
@@ -985,7 +985,7 @@
                 <w:noProof/>
                 <w:webHidden/>
               </w:rPr>
-              <w:instrText xml:space="preserve"> PAGEREF _Toc234955044 \h </w:instrText>
+              <w:instrText xml:space="preserve"> PAGEREF _Toc235544120 \h </w:instrText>
             </w:r>
             <w:r>
               <w:rPr>
@@ -1026,7 +1026,7 @@
               <w:noProof/>
             </w:rPr>
           </w:pPr>
-          <w:hyperlink w:anchor="_Toc234955045" w:history="1">
+          <w:hyperlink w:anchor="_Toc235544121" w:history="1">
             <w:r>
               <w:rPr>
                 <w:rStyle w:val="Hyperlink"/>
@@ -1053,7 +1053,7 @@
                 <w:noProof/>
                 <w:webHidden/>
               </w:rPr>
-              <w:instrText xml:space="preserve"> PAGEREF _Toc234955045 \h </w:instrText>
+              <w:instrText xml:space="preserve"> PAGEREF _Toc235544121 \h </w:instrText>
             </w:r>
             <w:r>
               <w:rPr>
@@ -1094,7 +1094,7 @@
               <w:noProof/>
             </w:rPr>
           </w:pPr>
-          <w:hyperlink w:anchor="_Toc234955046" w:history="1">
+          <w:hyperlink w:anchor="_Toc235544122" w:history="1">
             <w:r>
               <w:rPr>
                 <w:rStyle w:val="Hyperlink"/>
@@ -1121,7 +1121,7 @@
                 <w:noProof/>
                 <w:webHidden/>
               </w:rPr>
-              <w:instrText xml:space="preserve"> PAGEREF _Toc234955046 \h </w:instrText>
+              <w:instrText xml:space="preserve"> PAGEREF _Toc235544122 \h </w:instrText>
             </w:r>
             <w:r>
               <w:rPr>
@@ -1162,7 +1162,7 @@
               <w:noProof/>
             </w:rPr>
           </w:pPr>
-          <w:hyperlink w:anchor="_Toc234955047" w:history="1">
+          <w:hyperlink w:anchor="_Toc235544123" w:history="1">
             <w:r>
               <w:rPr>
                 <w:rStyle w:val="Hyperlink"/>
@@ -1189,7 +1189,7 @@
                 <w:noProof/>
                 <w:webHidden/>
               </w:rPr>
-              <w:instrText xml:space="preserve"> PAGEREF _Toc234955047 \h </w:instrText>
+              <w:instrText xml:space="preserve"> PAGEREF _Toc235544123 \h </w:instrText>
             </w:r>
             <w:r>
               <w:rPr>
@@ -1230,7 +1230,7 @@
               <w:noProof/>
             </w:rPr>
           </w:pPr>
-          <w:hyperlink w:anchor="_Toc234955048" w:history="1">
+          <w:hyperlink w:anchor="_Toc235544124" w:history="1">
             <w:r>
               <w:rPr>
                 <w:rStyle w:val="Hyperlink"/>
@@ -1257,7 +1257,7 @@
                 <w:noProof/>
                 <w:webHidden/>
               </w:rPr>
-              <w:instrText xml:space="preserve"> PAGEREF _Toc234955048 \h </w:instrText>
+              <w:instrText xml:space="preserve"> PAGEREF _Toc235544124 \h </w:instrText>
             </w:r>
             <w:r>
               <w:rPr>
@@ -1298,7 +1298,7 @@
               <w:noProof/>
             </w:rPr>
           </w:pPr>
-          <w:hyperlink w:anchor="_Toc234955049" w:history="1">
+          <w:hyperlink w:anchor="_Toc235544125" w:history="1">
             <w:r>
               <w:rPr>
                 <w:rStyle w:val="Hyperlink"/>
@@ -1325,7 +1325,7 @@
                 <w:noProof/>
                 <w:webHidden/>
               </w:rPr>
-              <w:instrText xml:space="preserve"> PAGEREF _Toc234955049 \h </w:instrText>
+              <w:instrText xml:space="preserve"> PAGEREF _Toc235544125 \h </w:instrText>
             </w:r>
             <w:r>
               <w:rPr>
@@ -1366,7 +1366,7 @@
               <w:noProof/>
             </w:rPr>
           </w:pPr>
-          <w:hyperlink w:anchor="_Toc234955050" w:history="1">
+          <w:hyperlink w:anchor="_Toc235544126" w:history="1">
             <w:r>
               <w:rPr>
                 <w:rStyle w:val="Hyperlink"/>
@@ -1393,7 +1393,7 @@
                 <w:noProof/>
                 <w:webHidden/>
               </w:rPr>
-              <w:instrText xml:space="preserve"> PAGEREF _Toc234955050 \h </w:instrText>
+              <w:instrText xml:space="preserve"> PAGEREF _Toc235544126 \h </w:instrText>
             </w:r>
             <w:r>
               <w:rPr>
@@ -1434,7 +1434,7 @@
               <w:noProof/>
             </w:rPr>
           </w:pPr>
-          <w:hyperlink w:anchor="_Toc234955051" w:history="1">
+          <w:hyperlink w:anchor="_Toc235544127" w:history="1">
             <w:r>
               <w:rPr>
                 <w:rStyle w:val="Hyperlink"/>
@@ -1461,7 +1461,7 @@
                 <w:noProof/>
                 <w:webHidden/>
               </w:rPr>
-              <w:instrText xml:space="preserve"> PAGEREF _Toc234955051 \h </w:instrText>
+              <w:instrText xml:space="preserve"> PAGEREF _Toc235544127 \h </w:instrText>
             </w:r>
             <w:r>
               <w:rPr>
@@ -1502,7 +1502,7 @@
               <w:noProof/>
             </w:rPr>
           </w:pPr>
-          <w:hyperlink w:anchor="_Toc234955052" w:history="1">
+          <w:hyperlink w:anchor="_Toc235544128" w:history="1">
             <w:r>
               <w:rPr>
                 <w:rStyle w:val="Hyperlink"/>
@@ -1529,7 +1529,7 @@
                 <w:noProof/>
                 <w:webHidden/>
               </w:rPr>
-              <w:instrText xml:space="preserve"> PAGEREF _Toc234955052 \h </w:instrText>
+              <w:instrText xml:space="preserve"> PAGEREF _Toc235544128 \h </w:instrText>
             </w:r>
             <w:r>
               <w:rPr>
@@ -1570,7 +1570,7 @@
               <w:noProof/>
             </w:rPr>
           </w:pPr>
-          <w:hyperlink w:anchor="_Toc234955053" w:history="1">
+          <w:hyperlink w:anchor="_Toc235544129" w:history="1">
             <w:r>
               <w:rPr>
                 <w:rStyle w:val="Hyperlink"/>
@@ -1597,7 +1597,7 @@
                 <w:noProof/>
                 <w:webHidden/>
               </w:rPr>
-              <w:instrText xml:space="preserve"> PAGEREF _Toc234955053 \h </w:instrText>
+              <w:instrText xml:space="preserve"> PAGEREF _Toc235544129 \h </w:instrText>
             </w:r>
             <w:r>
               <w:rPr>
@@ -1638,7 +1638,7 @@
               <w:noProof/>
             </w:rPr>
           </w:pPr>
-          <w:hyperlink w:anchor="_Toc234955054" w:history="1">
+          <w:hyperlink w:anchor="_Toc235544130" w:history="1">
             <w:r>
               <w:rPr>
                 <w:rStyle w:val="Hyperlink"/>
@@ -1665,7 +1665,7 @@
                 <w:noProof/>
                 <w:webHidden/>
               </w:rPr>
-              <w:instrText xml:space="preserve"> PAGEREF _Toc234955054 \h </w:instrText>
+              <w:instrText xml:space="preserve"> PAGEREF _Toc235544130 \h </w:instrText>
             </w:r>
             <w:r>
               <w:rPr>
@@ -1706,7 +1706,7 @@
               <w:noProof/>
             </w:rPr>
           </w:pPr>
-          <w:hyperlink w:anchor="_Toc234955055" w:history="1">
+          <w:hyperlink w:anchor="_Toc235544131" w:history="1">
             <w:r>
               <w:rPr>
                 <w:rStyle w:val="Hyperlink"/>
@@ -1733,7 +1733,7 @@
                 <w:noProof/>
                 <w:webHidden/>
               </w:rPr>
-              <w:instrText xml:space="preserve"> PAGEREF _Toc234955055 \h </w:instrText>
+              <w:instrText xml:space="preserve"> PAGEREF _Toc235544131 \h </w:instrText>
             </w:r>
             <w:r>
               <w:rPr>
@@ -1774,7 +1774,7 @@
               <w:noProof/>
             </w:rPr>
           </w:pPr>
-          <w:hyperlink w:anchor="_Toc234955056" w:history="1">
+          <w:hyperlink w:anchor="_Toc235544132" w:history="1">
             <w:r>
               <w:rPr>
                 <w:rStyle w:val="Hyperlink"/>
@@ -1801,7 +1801,7 @@
                 <w:noProof/>
                 <w:webHidden/>
               </w:rPr>
-              <w:instrText xml:space="preserve"> PAGEREF _Toc234955056 \h </w:instrText>
+              <w:instrText xml:space="preserve"> PAGEREF _Toc235544132 \h </w:instrText>
             </w:r>
             <w:r>
               <w:rPr>
@@ -1842,7 +1842,7 @@
               <w:noProof/>
             </w:rPr>
           </w:pPr>
-          <w:hyperlink w:anchor="_Toc234955057" w:history="1">
+          <w:hyperlink w:anchor="_Toc235544133" w:history="1">
             <w:r>
               <w:rPr>
                 <w:rStyle w:val="Hyperlink"/>
@@ -1869,7 +1869,7 @@
                 <w:noProof/>
                 <w:webHidden/>
               </w:rPr>
-              <w:instrText xml:space="preserve"> PAGEREF _Toc234955057 \h </w:instrText>
+              <w:instrText xml:space="preserve"> PAGEREF _Toc235544133 \h </w:instrText>
             </w:r>
             <w:r>
               <w:rPr>
@@ -1910,7 +1910,7 @@
               <w:noProof/>
             </w:rPr>
           </w:pPr>
-          <w:hyperlink w:anchor="_Toc234955058" w:history="1">
+          <w:hyperlink w:anchor="_Toc235544134" w:history="1">
             <w:r>
               <w:rPr>
                 <w:rStyle w:val="Hyperlink"/>
@@ -1937,7 +1937,7 @@
                 <w:noProof/>
                 <w:webHidden/>
               </w:rPr>
-              <w:instrText xml:space="preserve"> PAGEREF _Toc234955058 \h </w:instrText>
+              <w:instrText xml:space="preserve"> PAGEREF _Toc235544134 \h </w:instrText>
             </w:r>
             <w:r>
               <w:rPr>
@@ -1957,7 +1957,7 @@
                 <w:noProof/>
                 <w:webHidden/>
               </w:rPr>
-              <w:t>281</w:t>
+              <w:t>280</w:t>
             </w:r>
             <w:r>
               <w:rPr>
@@ -1978,7 +1978,7 @@
               <w:noProof/>
             </w:rPr>
           </w:pPr>
-          <w:hyperlink w:anchor="_Toc234955059" w:history="1">
+          <w:hyperlink w:anchor="_Toc235544135" w:history="1">
             <w:r>
               <w:rPr>
                 <w:rStyle w:val="Hyperlink"/>
@@ -2005,7 +2005,7 @@
                 <w:noProof/>
                 <w:webHidden/>
               </w:rPr>
-              <w:instrText xml:space="preserve"> PAGEREF _Toc234955059 \h </w:instrText>
+              <w:instrText xml:space="preserve"> PAGEREF _Toc235544135 \h </w:instrText>
             </w:r>
             <w:r>
               <w:rPr>
@@ -2025,7 +2025,7 @@
                 <w:noProof/>
                 <w:webHidden/>
               </w:rPr>
-              <w:t>290</w:t>
+              <w:t>289</w:t>
             </w:r>
             <w:r>
               <w:rPr>
@@ -2046,7 +2046,7 @@
               <w:noProof/>
             </w:rPr>
           </w:pPr>
-          <w:hyperlink w:anchor="_Toc234955060" w:history="1">
+          <w:hyperlink w:anchor="_Toc235544136" w:history="1">
             <w:r>
               <w:rPr>
                 <w:rStyle w:val="Hyperlink"/>
@@ -2073,7 +2073,7 @@
                 <w:noProof/>
                 <w:webHidden/>
               </w:rPr>
-              <w:instrText xml:space="preserve"> PAGEREF _Toc234955060 \h </w:instrText>
+              <w:instrText xml:space="preserve"> PAGEREF _Toc235544136 \h </w:instrText>
             </w:r>
             <w:r>
               <w:rPr>
@@ -2114,7 +2114,7 @@
               <w:noProof/>
             </w:rPr>
           </w:pPr>
-          <w:hyperlink w:anchor="_Toc234955061" w:history="1">
+          <w:hyperlink w:anchor="_Toc235544137" w:history="1">
             <w:r>
               <w:rPr>
                 <w:rStyle w:val="Hyperlink"/>
@@ -2141,7 +2141,75 @@
                 <w:noProof/>
                 <w:webHidden/>
               </w:rPr>
-              <w:instrText xml:space="preserve"> PAGEREF _Toc234955061 \h </w:instrText>
+              <w:instrText xml:space="preserve"> PAGEREF _Toc235544137 \h </w:instrText>
+            </w:r>
+            <w:r>
+              <w:rPr>
+                <w:noProof/>
+                <w:webHidden/>
+              </w:rPr>
+            </w:r>
+            <w:r>
+              <w:rPr>
+                <w:noProof/>
+                <w:webHidden/>
+              </w:rPr>
+              <w:fldChar w:fldCharType="separate"/>
+            </w:r>
+            <w:r>
+              <w:rPr>
+                <w:noProof/>
+                <w:webHidden/>
+              </w:rPr>
+              <w:t>302</w:t>
+            </w:r>
+            <w:r>
+              <w:rPr>
+                <w:noProof/>
+                <w:webHidden/>
+              </w:rPr>
+              <w:fldChar w:fldCharType="end"/>
+            </w:r>
+          </w:hyperlink>
+        </w:p>
+        <w:p>
+          <w:pPr>
+            <w:pStyle w:val="TOC1"/>
+            <w:tabs>
+              <w:tab w:val="right" w:leader="dot" w:pos="9350"/>
+            </w:tabs>
+            <w:rPr>
+              <w:noProof/>
+            </w:rPr>
+          </w:pPr>
+          <w:hyperlink w:anchor="_Toc235544138" w:history="1">
+            <w:r>
+              <w:rPr>
+                <w:rStyle w:val="Hyperlink"/>
+                <w:noProof/>
+              </w:rPr>
+              <w:t>APPENDIX A — Fleet Vessel Reference</w:t>
+            </w:r>
+            <w:r>
+              <w:rPr>
+                <w:noProof/>
+                <w:webHidden/>
+              </w:rPr>
+              <w:tab/>
+            </w:r>
+            <w:r>
+              <w:rPr>
+                <w:noProof/>
+                <w:webHidden/>
+              </w:rPr>
+              <w:fldChar w:fldCharType="begin"/>
+            </w:r>
+            <w:r>
+              <w:rPr>
+                <w:noProof/>
+                <w:webHidden/>
+              </w:rPr>
+              <w:instrText xml:space="preserve"> PAGEREF _Toc235544138 \h </w:instrText>
             </w:r>
             <w:r>
               <w:rPr>
@@ -2182,75 +2250,7 @@
               <w:noProof/>
             </w:rPr>
           </w:pPr>
-          <w:hyperlink w:anchor="_Toc234955062" w:history="1">
-            <w:r>
-              <w:rPr>
-                <w:rStyle w:val="Hyperlink"/>
-                <w:noProof/>
-              </w:rPr>
-              <w:t>APPENDIX A — Fleet Vessel Reference</w:t>
-            </w:r>
-            <w:r>
-              <w:rPr>
-                <w:noProof/>
-                <w:webHidden/>
-              </w:rPr>
-              <w:tab/>
-            </w:r>
-            <w:r>
-              <w:rPr>
-                <w:noProof/>
-                <w:webHidden/>
-              </w:rPr>
-              <w:fldChar w:fldCharType="begin"/>
-            </w:r>
-            <w:r>
-              <w:rPr>
-                <w:noProof/>
-                <w:webHidden/>
-              </w:rPr>
-              <w:instrText xml:space="preserve"> PAGEREF _Toc234955062 \h </w:instrText>
-            </w:r>
-            <w:r>
-              <w:rPr>
-                <w:noProof/>
-                <w:webHidden/>
-              </w:rPr>
-            </w:r>
-            <w:r>
-              <w:rPr>
-                <w:noProof/>
-                <w:webHidden/>
-              </w:rPr>
-              <w:fldChar w:fldCharType="separate"/>
-            </w:r>
-            <w:r>
-              <w:rPr>
-                <w:noProof/>
-                <w:webHidden/>
-              </w:rPr>
-              <w:t>303</w:t>
-            </w:r>
-            <w:r>
-              <w:rPr>
-                <w:noProof/>
-                <w:webHidden/>
-              </w:rPr>
-              <w:fldChar w:fldCharType="end"/>
-            </w:r>
-          </w:hyperlink>
-        </w:p>
-        <w:p>
-          <w:pPr>
-            <w:pStyle w:val="TOC1"/>
-            <w:tabs>
-              <w:tab w:val="right" w:leader="dot" w:pos="9350"/>
-            </w:tabs>
-            <w:rPr>
-              <w:noProof/>
-            </w:rPr>
-          </w:pPr>
-          <w:hyperlink w:anchor="_Toc234955063" w:history="1">
+          <w:hyperlink w:anchor="_Toc235544139" w:history="1">
             <w:r>
               <w:rPr>
                 <w:rStyle w:val="Hyperlink"/>
@@ -2277,7 +2277,7 @@
                 <w:noProof/>
                 <w:webHidden/>
               </w:rPr>
-              <w:instrText xml:space="preserve"> PAGEREF _Toc234955063 \h </w:instrText>
+              <w:instrText xml:space="preserve"> PAGEREF _Toc235544139 \h </w:instrText>
             </w:r>
             <w:r>
               <w:rPr>
@@ -2318,7 +2318,7 @@
               <w:noProof/>
             </w:rPr>
           </w:pPr>
-          <w:hyperlink w:anchor="_Toc234955064" w:history="1">
+          <w:hyperlink w:anchor="_Toc235544140" w:history="1">
             <w:r>
               <w:rPr>
                 <w:rStyle w:val="Hyperlink"/>
@@ -2345,7 +2345,7 @@
                 <w:noProof/>
                 <w:webHidden/>
               </w:rPr>
-              <w:instrText xml:space="preserve"> PAGEREF _Toc234955064 \h </w:instrText>
+              <w:instrText xml:space="preserve"> PAGEREF _Toc235544140 \h </w:instrText>
             </w:r>
             <w:r>
               <w:rPr>
@@ -2386,7 +2386,7 @@
               <w:noProof/>
             </w:rPr>
           </w:pPr>
-          <w:hyperlink w:anchor="_Toc234955065" w:history="1">
+          <w:hyperlink w:anchor="_Toc235544141" w:history="1">
             <w:r>
               <w:rPr>
                 <w:rStyle w:val="Hyperlink"/>
@@ -2413,7 +2413,7 @@
                 <w:noProof/>
                 <w:webHidden/>
               </w:rPr>
-              <w:instrText xml:space="preserve"> PAGEREF _Toc234955065 \h </w:instrText>
+              <w:instrText xml:space="preserve"> PAGEREF _Toc235544141 \h </w:instrText>
             </w:r>
             <w:r>
               <w:rPr>
@@ -2454,7 +2454,7 @@
               <w:noProof/>
             </w:rPr>
           </w:pPr>
-          <w:hyperlink w:anchor="_Toc234955066" w:history="1">
+          <w:hyperlink w:anchor="_Toc235544142" w:history="1">
             <w:r>
               <w:rPr>
                 <w:rStyle w:val="Hyperlink"/>
@@ -2481,7 +2481,75 @@
                 <w:noProof/>
                 <w:webHidden/>
               </w:rPr>
-              <w:instrText xml:space="preserve"> PAGEREF _Toc234955066 \h </w:instrText>
+              <w:instrText xml:space="preserve"> PAGEREF _Toc235544142 \h </w:instrText>
+            </w:r>
+            <w:r>
+              <w:rPr>
+                <w:noProof/>
+                <w:webHidden/>
+              </w:rPr>
+            </w:r>
+            <w:r>
+              <w:rPr>
+                <w:noProof/>
+                <w:webHidden/>
+              </w:rPr>
+              <w:fldChar w:fldCharType="separate"/>
+            </w:r>
+            <w:r>
+              <w:rPr>
+                <w:noProof/>
+                <w:webHidden/>
+              </w:rPr>
+              <w:t>313</w:t>
+            </w:r>
+            <w:r>
+              <w:rPr>
+                <w:noProof/>
+                <w:webHidden/>
+              </w:rPr>
+              <w:fldChar w:fldCharType="end"/>
+            </w:r>
+          </w:hyperlink>
+        </w:p>
+        <w:p>
+          <w:pPr>
+            <w:pStyle w:val="TOC1"/>
+            <w:tabs>
+              <w:tab w:val="right" w:leader="dot" w:pos="9350"/>
+            </w:tabs>
+            <w:rPr>
+              <w:noProof/>
+            </w:rPr>
+          </w:pPr>
+          <w:hyperlink w:anchor="_Toc235544143" w:history="1">
+            <w:r>
+              <w:rPr>
+                <w:rStyle w:val="Hyperlink"/>
+                <w:noProof/>
+              </w:rPr>
+              <w:t>APPENDIX F — Fleet Operational Chart</w:t>
+            </w:r>
+            <w:r>
+              <w:rPr>
+                <w:noProof/>
+                <w:webHidden/>
+              </w:rPr>
+              <w:tab/>
+            </w:r>
+            <w:r>
+              <w:rPr>
+                <w:noProof/>
+                <w:webHidden/>
+              </w:rPr>
+              <w:fldChar w:fldCharType="begin"/>
+            </w:r>
+            <w:r>
+              <w:rPr>
+                <w:noProof/>
+                <w:webHidden/>
+              </w:rPr>
+              <w:instrText xml:space="preserve"> PAGEREF _Toc235544143 \h </w:instrText>
             </w:r>
             <w:r>
               <w:rPr>
@@ -2522,75 +2590,7 @@
               <w:noProof/>
             </w:rPr>
           </w:pPr>
-          <w:hyperlink w:anchor="_Toc234955067" w:history="1">
-            <w:r>
-              <w:rPr>
-                <w:rStyle w:val="Hyperlink"/>
-                <w:noProof/>
-              </w:rPr>
-              <w:t>APPENDIX F — Fleet Operational Chart</w:t>
-            </w:r>
-            <w:r>
-              <w:rPr>
-                <w:noProof/>
-                <w:webHidden/>
-              </w:rPr>
-              <w:tab/>
-            </w:r>
-            <w:r>
-              <w:rPr>
-                <w:noProof/>
-                <w:webHidden/>
-              </w:rPr>
-              <w:fldChar w:fldCharType="begin"/>
-            </w:r>
-            <w:r>
-              <w:rPr>
-                <w:noProof/>
-                <w:webHidden/>
-              </w:rPr>
-              <w:instrText xml:space="preserve"> PAGEREF _Toc234955067 \h </w:instrText>
-            </w:r>
-            <w:r>
-              <w:rPr>
-                <w:noProof/>
-                <w:webHidden/>
-              </w:rPr>
-            </w:r>
-            <w:r>
-              <w:rPr>
-                <w:noProof/>
-                <w:webHidden/>
-              </w:rPr>
-              <w:fldChar w:fldCharType="separate"/>
-            </w:r>
-            <w:r>
-              <w:rPr>
-                <w:noProof/>
-                <w:webHidden/>
-              </w:rPr>
-              <w:t>315</w:t>
-            </w:r>
-            <w:r>
-              <w:rPr>
-                <w:noProof/>
-                <w:webHidden/>
-              </w:rPr>
-              <w:fldChar w:fldCharType="end"/>
-            </w:r>
-          </w:hyperlink>
-        </w:p>
-        <w:p>
-          <w:pPr>
-            <w:pStyle w:val="TOC1"/>
-            <w:tabs>
-              <w:tab w:val="right" w:leader="dot" w:pos="9350"/>
-            </w:tabs>
-            <w:rPr>
-              <w:noProof/>
-            </w:rPr>
-          </w:pPr>
-          <w:hyperlink w:anchor="_Toc234955068" w:history="1">
+          <w:hyperlink w:anchor="_Toc235544144" w:history="1">
             <w:r>
               <w:rPr>
                 <w:rStyle w:val="Hyperlink"/>
@@ -2617,7 +2617,7 @@
                 <w:noProof/>
                 <w:webHidden/>
               </w:rPr>
-              <w:instrText xml:space="preserve"> PAGEREF _Toc234955068 \h </w:instrText>
+              <w:instrText xml:space="preserve"> PAGEREF _Toc235544144 \h </w:instrText>
             </w:r>
             <w:r>
               <w:rPr>
@@ -2660,7 +2660,7 @@
         <w:pStyle w:val="Heading1"/>
       </w:pPr>
       <w:bookmarkStart w:id="0" w:name="copyright"/>
-      <w:bookmarkStart w:id="1" w:name="_Toc234955031"/>
+      <w:bookmarkStart w:id="1" w:name="_Toc235544107"/>
       <w:r>
         <w:t>Copyright</w:t>
       </w:r>
@@ -2729,7 +2729,7 @@
         <w:pStyle w:val="Heading1"/>
       </w:pPr>
       <w:bookmarkStart w:id="2" w:name="prologue"/>
-      <w:bookmarkStart w:id="3" w:name="_Toc234955032"/>
+      <w:bookmarkStart w:id="3" w:name="_Toc235544108"/>
       <w:bookmarkEnd w:id="0"/>
       <w:r>
         <w:t>Prologue</w:t>
@@ -2821,7 +2821,7 @@
         <w:pStyle w:val="Heading1"/>
       </w:pPr>
       <w:bookmarkStart w:id="4" w:name="archive"/>
-      <w:bookmarkStart w:id="5" w:name="_Toc234955033"/>
+      <w:bookmarkStart w:id="5" w:name="_Toc235544109"/>
       <w:bookmarkEnd w:id="2"/>
       <w:r>
         <w:t>Archive</w:t>
@@ -2929,7 +2929,7 @@
         <w:pStyle w:val="Heading1"/>
       </w:pPr>
       <w:bookmarkStart w:id="8" w:name="chapter-1-the-empire"/>
-      <w:bookmarkStart w:id="9" w:name="_Toc234955034"/>
+      <w:bookmarkStart w:id="9" w:name="_Toc235544110"/>
       <w:bookmarkEnd w:id="4"/>
       <w:bookmarkEnd w:id="6"/>
       <w:bookmarkEnd w:id="7"/>
@@ -4337,7 +4337,7 @@
         <w:pStyle w:val="Heading1"/>
       </w:pPr>
       <w:bookmarkStart w:id="10" w:name="chapter-2-a-captains-dream"/>
-      <w:bookmarkStart w:id="11" w:name="_Toc234955035"/>
+      <w:bookmarkStart w:id="11" w:name="_Toc235544111"/>
       <w:bookmarkEnd w:id="8"/>
       <w:r>
         <w:t>Chapter 2 — A Captain’s Dream</w:t>
@@ -6643,7 +6643,7 @@
         <w:pStyle w:val="Heading1"/>
       </w:pPr>
       <w:bookmarkStart w:id="12" w:name="chapter-3-the-ship-that-refuses-to-die"/>
-      <w:bookmarkStart w:id="13" w:name="_Toc234955036"/>
+      <w:bookmarkStart w:id="13" w:name="_Toc235544112"/>
       <w:bookmarkEnd w:id="10"/>
       <w:r>
         <w:t>Chapter 3 — The Ship That Refuses to Die</w:t>
@@ -6692,7 +6692,7 @@
         <w:pStyle w:val="BodyText"/>
       </w:pPr>
       <w:r>
-        <w:t>Corridor B ran bright white into amber into a panel that flickered at the edge of regulation. A strip of yellow tape marked a dent in the port-side bulkhead—non-structural, documented, ignored. Calder’s boot caught the edge of it anyway.</w:t>
+        <w:t>Corridor B ran bright white into amber into a panel that flickered at the edge of regulation. Another strip of yellow tape marked a dent in the port-side bulkhead—non-structural, documented, ignored. Calder’s boot caught the edge of it anyway.</w:t>
       </w:r>
     </w:p>
     <w:p>
@@ -7257,7 +7257,7 @@
         <w:pStyle w:val="BodyText"/>
       </w:pPr>
       <w:r>
-        <w:t>The access ladder rung spacing was wrong for Calder’s academy training—wider at the bottom, narrow at the top, adjusted once by someone who had measured with a knee rather than a spec sheet. Heat increased in sensible degrees. Sound changed from environmental thrum to something more specific: a bearing that was not yet failing, a pump that was not yet complaint.</w:t>
+        <w:t>The access ladder rung spacing was wrong for Calder’s academy training—wider at the bottom, narrow at the top, adjusted once by someone who had measured with a knee rather than a spec sheet. Heat increased in sensible degrees. Sound changed from environmental thrum to something more specific: a bearing that was not yet failing, a pump that was not yet compliant.</w:t>
       </w:r>
     </w:p>
     <w:p>
@@ -7391,7 +7391,7 @@
         <w:pStyle w:val="BodyText"/>
       </w:pPr>
       <w:r>
-        <w:t>Calder looked at Devon Walsh, who had appeared with a cargo manifest slate and the expression of a man accustomed to being invisible until logistics failed.</w:t>
+        <w:t>Calder looked at Lena Walsh, who had appeared with a cargo manifest slate and the expression of a woman accustomed to being invisible until logistics failed.</w:t>
       </w:r>
     </w:p>
     <w:p>
@@ -7482,7 +7482,7 @@
         <w:t xml:space="preserve">“Quartermaster is not a formal billet on scout complement,” Thessaly said quietly as they climbed. </w:t>
       </w:r>
       <w:r>
-        <w:t>“Walsh is the closest we have. He knows where every spare seal and half-depleted ration crate lives. Dennett stopped pretending Fleet templates matched this ship in month two.”</w:t>
+        <w:t>“Walsh is the closest we have. She knows where every spare seal and half-depleted ration crate lives. Dennett stopped pretending Fleet templates matched this ship in month two.”</w:t>
       </w:r>
     </w:p>
     <w:p>
@@ -7900,7 +7900,7 @@
         <w:pStyle w:val="BodyText"/>
       </w:pPr>
       <w:r>
-        <w:t xml:space="preserve">Walsh had put his checklist on Calder’s slate with arrows where Fleet’s template used boxes. Calder walked the route in Walsh’s order and let crew pass without redirecting them. He was still matching hatch initials to names and margin notes to the people who had written </w:t>
+        <w:t xml:space="preserve">Walsh had put her checklist on Calder’s slate with arrows where Fleet’s template used boxes. Calder walked the route in Walsh’s order and let crew pass without redirecting them. He was still matching hatch initials to names and margin notes to the people who had written </w:t>
       </w:r>
       <w:r>
         <w:rPr>
@@ -8234,7 +8234,7 @@
         <w:pStyle w:val="BodyText"/>
       </w:pPr>
       <w:r>
-        <w:t>Walsh stood at the hatch with his personal notebook—not offered, not hidden.</w:t>
+        <w:t>Walsh stood at the hatch with her personal notebook—not offered, not hidden.</w:t>
       </w:r>
     </w:p>
     <w:p>
@@ -8253,7 +8253,7 @@
         <w:pStyle w:val="BodyText"/>
       </w:pPr>
       <w:r>
-        <w:t>Thessaly looked at Walsh. Walsh looked at his notebook. “Dennett ran Fleet rotation until jump minus six, then moved Brenner to post-jump recovery. Tanaka needs the lift for sequence staging. Brenner needs it for the lower port panel. They share the corridor or they collide.”</w:t>
+        <w:t>Thessaly looked at Walsh. Walsh looked at her notebook. “Dennett ran Fleet rotation until jump minus six, then moved Brenner to post-jump recovery. Tanaka needs the lift for sequence staging. Brenner needs it for the lower port panel. They share the corridor or they collide.”</w:t>
       </w:r>
     </w:p>
     <w:p>
@@ -8301,7 +8301,7 @@
         <w:pStyle w:val="BodyText"/>
       </w:pPr>
       <w:r>
-        <w:t>Walsh closed his notebook. “I’ll update the master checklist.”</w:t>
+        <w:t>Walsh closed her notebook. “I’ll update the master checklist.”</w:t>
       </w:r>
     </w:p>
     <w:p>
@@ -8782,7 +8782,7 @@
         <w:t xml:space="preserve">“Primary route locked,” Reyes said from the command deck. </w:t>
       </w:r>
       <w:r>
-        <w:t xml:space="preserve">“Tanaka, sequence staging.” Tanaka acknowledged while Ortega took tertiary channel monitoring during jump prep—log dropouts, do not combine until Koss cleared hardware fault. Walsh moved through the ship with his checklist—new line at the bottom: </w:t>
+        <w:t xml:space="preserve">“Tanaka, sequence staging.” Tanaka acknowledged while Ortega took tertiary channel monitoring during jump prep—log dropouts, do not combine until Koss cleared hardware fault. Walsh moved through the ship with her checklist—new line at the bottom: </w:t>
       </w:r>
       <w:r>
         <w:rPr>
@@ -9255,7 +9255,7 @@
         <w:pStyle w:val="Heading1"/>
       </w:pPr>
       <w:bookmarkStart w:id="14" w:name="chapter-4-routine-patrol"/>
-      <w:bookmarkStart w:id="15" w:name="_Toc234955037"/>
+      <w:bookmarkStart w:id="15" w:name="_Toc235544113"/>
       <w:bookmarkEnd w:id="12"/>
       <w:r>
         <w:t>Chapter 4 — Routine Patrol</w:t>
@@ -9372,7 +9372,7 @@
         <w:pStyle w:val="BodyText"/>
       </w:pPr>
       <w:r>
-        <w:t xml:space="preserve">Park had placed it there without announcement. Thessaly had not commented. Walsh had already added a line to his checklist that morning: </w:t>
+        <w:t xml:space="preserve">Park had placed it there without announcement. Thessaly had not commented. Walsh had already added a line to her checklist that morning: </w:t>
       </w:r>
       <w:r>
         <w:rPr>
@@ -10114,7 +10114,7 @@
         <w:pStyle w:val="BodyText"/>
       </w:pPr>
       <w:r>
-        <w:t xml:space="preserve">On the stores deck, Walsh moved through the bins with a strip in his hand and his eyes on the shelves, not the manifest. He counted thermal patches by touch where Fleet’s log said the bin was empty. He opened a crate marked </w:t>
+        <w:t xml:space="preserve">On the stores deck, Walsh moved through the bins with a strip in her hand and her eyes on the shelves, not the manifest. She counted thermal patches by touch where Fleet’s log said the bin was empty. She opened a crate marked </w:t>
       </w:r>
       <w:r>
         <w:rPr>
@@ -10124,7 +10124,7 @@
         <w:t>borrowed from Berth 12</w:t>
       </w:r>
       <w:r>
-        <w:t>, verified the seal count against his notebook, closed it. He scratched a correction on the strip and kept walking. Calder passed without speaking. Walsh nodded at the strip, not at him.</w:t>
+        <w:t>, verified the seal count against her notebook, closed it. She scratched a correction on the strip and kept walking. Calder passed without speaking. Walsh nodded at the strip, not at him.</w:t>
       </w:r>
     </w:p>
     <w:p>
@@ -10211,7 +10211,7 @@
         <w:t xml:space="preserve">Walsh appeared with a stores strip and no apology for existing in a corridor. </w:t>
       </w:r>
       <w:r>
-        <w:t>“Mid-cycle reconciliation,” he said to Thessaly. “Honest count matches manifest. Fleet pretty count still wrong by two thermal patch crates. Checklist addendum holds—unexpected provisioning pending variance review.”</w:t>
+        <w:t>“Mid-cycle reconciliation,” she said to Thessaly. “Honest count matches manifest. Fleet pretty count still wrong by two thermal patch crates. Checklist addendum holds—unexpected provisioning pending variance review.”</w:t>
       </w:r>
     </w:p>
     <w:p>
@@ -10227,15 +10227,15 @@
         <w:pStyle w:val="BodyText"/>
       </w:pPr>
       <w:r>
-        <w:t>“Already logged.” Walsh left the way he arrived—quiet, necessary, gone.</w:t>
-      </w:r>
-    </w:p>
-    <w:p>
-      <w:pPr>
-        <w:pStyle w:val="BodyText"/>
-      </w:pPr>
-      <w:r>
-        <w:t>Calder did not intercept him.</w:t>
+        <w:t>“Already logged.” Walsh left the way she arrived—quiet, necessary, gone.</w:t>
+      </w:r>
+    </w:p>
+    <w:p>
+      <w:pPr>
+        <w:pStyle w:val="BodyText"/>
+      </w:pPr>
+      <w:r>
+        <w:t>Calder did not intercept her.</w:t>
       </w:r>
     </w:p>
     <w:p>
@@ -10762,7 +10762,7 @@
         <w:pStyle w:val="Heading1"/>
       </w:pPr>
       <w:bookmarkStart w:id="16" w:name="chapter-5-missions-end"/>
-      <w:bookmarkStart w:id="17" w:name="_Toc234955038"/>
+      <w:bookmarkStart w:id="17" w:name="_Toc235544114"/>
       <w:bookmarkEnd w:id="14"/>
       <w:r>
         <w:t>Chapter 5 — Mission’s End</w:t>
@@ -10869,7 +10869,7 @@
         <w:t>Between Mission +02:00 and Mission +03:00 the mapping sweep settled into the rhythm Reyes had described at undock—corrections too small to announce, data too routine to interrupt meals. Tanaka staged arcs eight through eleven while Reyes overlaid Fleet chart and margin marks in parallel, running each batch twice and logging both when solutions matched within tolerance. Cole covered comms while Park ate from the forward carton without leaving his chair; Mehta stepped left around the Corridor C dent on a main</w:t>
       </w:r>
       <w:r>
-        <w:t>tenance loop; Hale ran a tactical systems calibration in the galley corridor nook—green check, one adjustment, green again. Walsh came through at Mission +02:40 with a stores strip, checked the forward carton against his manifest line, nodded once, and left without breaking anyone’s concentration.</w:t>
+        <w:t>tenance loop; Hale ran a tactical systems calibration in the galley corridor nook—green check, one adjustment, green again. Walsh came through at Mission +02:40 with a stores strip, checked the forward carton against her manifest line, nodded once, and left without breaking anyone’s concentration.</w:t>
       </w:r>
     </w:p>
     <w:p>
@@ -11162,7 +11162,7 @@
         <w:pStyle w:val="BodyText"/>
       </w:pPr>
       <w:r>
-        <w:t>Walsh paused at the aft hatch long enough to read posture, not the board. Reyes had not rotated since the first fragment. Walsh set a hydration pouch on the lip of Ortega’s board and marked the watch clock on his slate without interrupting.</w:t>
+        <w:t>Walsh paused at the aft hatch long enough to read posture, not the board. Reyes had not rotated since the first fragment. Walsh set a hydration pouch on the lip of Ortega’s board and marked the watch clock on her slate without interrupting.</w:t>
       </w:r>
     </w:p>
     <w:p>
@@ -13449,7 +13449,7 @@
         <w:pStyle w:val="Heading1"/>
       </w:pPr>
       <w:bookmarkStart w:id="18" w:name="chapter-6-witness"/>
-      <w:bookmarkStart w:id="19" w:name="_Toc234955039"/>
+      <w:bookmarkStart w:id="19" w:name="_Toc235544115"/>
       <w:bookmarkEnd w:id="16"/>
       <w:r>
         <w:t>Chapter 6 — Witness</w:t>
@@ -15897,7 +15897,7 @@
         <w:pStyle w:val="Heading1"/>
       </w:pPr>
       <w:bookmarkStart w:id="20" w:name="chapter-7-the-living-ship"/>
-      <w:bookmarkStart w:id="21" w:name="_Toc234955040"/>
+      <w:bookmarkStart w:id="21" w:name="_Toc235544116"/>
       <w:bookmarkEnd w:id="18"/>
       <w:r>
         <w:t>Chapter 7 — The Living Ship</w:t>
@@ -21661,7 +21661,7 @@
         <w:pStyle w:val="Heading1"/>
       </w:pPr>
       <w:bookmarkStart w:id="22" w:name="chapter-8-the-quiet-before-the-silence"/>
-      <w:bookmarkStart w:id="23" w:name="_Toc234955041"/>
+      <w:bookmarkStart w:id="23" w:name="_Toc235544117"/>
       <w:bookmarkEnd w:id="20"/>
       <w:r>
         <w:t>Chapter 8 — The Quiet Before the Silence</w:t>
@@ -24000,7 +24000,7 @@
         <w:pStyle w:val="Heading1"/>
       </w:pPr>
       <w:bookmarkStart w:id="24" w:name="archive-1"/>
-      <w:bookmarkStart w:id="25" w:name="_Toc234955042"/>
+      <w:bookmarkStart w:id="25" w:name="_Toc235544118"/>
       <w:bookmarkEnd w:id="22"/>
       <w:r>
         <w:t>Archive</w:t>
@@ -24136,7 +24136,7 @@
         <w:pStyle w:val="Heading1"/>
       </w:pPr>
       <w:bookmarkStart w:id="26" w:name="chapter-9-across-the-line"/>
-      <w:bookmarkStart w:id="27" w:name="_Toc234955043"/>
+      <w:bookmarkStart w:id="27" w:name="_Toc235544119"/>
       <w:bookmarkEnd w:id="24"/>
       <w:r>
         <w:t>Chapter 9 — Across the Line</w:t>
@@ -26305,7 +26305,7 @@
         <w:pStyle w:val="Heading1"/>
       </w:pPr>
       <w:bookmarkStart w:id="28" w:name="chapter-10-ghosts-in-the-dark"/>
-      <w:bookmarkStart w:id="29" w:name="_Toc234955044"/>
+      <w:bookmarkStart w:id="29" w:name="_Toc235544120"/>
       <w:bookmarkEnd w:id="26"/>
       <w:r>
         <w:t>Chapter 10 — Ghosts in the Dark</w:t>
@@ -28131,7 +28131,7 @@
         <w:pStyle w:val="Heading1"/>
       </w:pPr>
       <w:bookmarkStart w:id="30" w:name="chapter-11-silent-crossings"/>
-      <w:bookmarkStart w:id="31" w:name="_Toc234955045"/>
+      <w:bookmarkStart w:id="31" w:name="_Toc235544121"/>
       <w:bookmarkEnd w:id="28"/>
       <w:r>
         <w:t>Chapter 11 — Silent Crossings</w:t>
@@ -29835,7 +29835,7 @@
         <w:pStyle w:val="Heading1"/>
       </w:pPr>
       <w:bookmarkStart w:id="32" w:name="chapter-12-whispers-in-the-corridor"/>
-      <w:bookmarkStart w:id="33" w:name="_Toc234955046"/>
+      <w:bookmarkStart w:id="33" w:name="_Toc235544122"/>
       <w:bookmarkEnd w:id="30"/>
       <w:r>
         <w:t>Chapter 12 — Whispers in the Corridor</w:t>
@@ -31927,7 +31927,7 @@
         <w:pStyle w:val="Heading1"/>
       </w:pPr>
       <w:bookmarkStart w:id="34" w:name="chapter-13-the-weight-of-preparation"/>
-      <w:bookmarkStart w:id="35" w:name="_Toc234955047"/>
+      <w:bookmarkStart w:id="35" w:name="_Toc235544123"/>
       <w:bookmarkEnd w:id="32"/>
       <w:r>
         <w:t>Chapter 13 — The Weight of Preparation</w:t>
@@ -33702,7 +33702,7 @@
         <w:pStyle w:val="Heading1"/>
       </w:pPr>
       <w:bookmarkStart w:id="36" w:name="chapter-14-inheritance"/>
-      <w:bookmarkStart w:id="37" w:name="_Toc234955048"/>
+      <w:bookmarkStart w:id="37" w:name="_Toc235544124"/>
       <w:bookmarkEnd w:id="34"/>
       <w:r>
         <w:t>Chapter 14 — Inheritance</w:t>
@@ -35592,7 +35592,7 @@
         <w:pStyle w:val="Heading1"/>
       </w:pPr>
       <w:bookmarkStart w:id="38" w:name="chapter-15-the-point-of-no-return"/>
-      <w:bookmarkStart w:id="39" w:name="_Toc234955049"/>
+      <w:bookmarkStart w:id="39" w:name="_Toc235544125"/>
       <w:bookmarkEnd w:id="36"/>
       <w:r>
         <w:t>Chapter 15 — The Point of No Return</w:t>
@@ -37723,7 +37723,7 @@
         <w:pStyle w:val="Heading1"/>
       </w:pPr>
       <w:bookmarkStart w:id="40" w:name="chapter-16-homeward"/>
-      <w:bookmarkStart w:id="41" w:name="_Toc234955050"/>
+      <w:bookmarkStart w:id="41" w:name="_Toc235544126"/>
       <w:bookmarkEnd w:id="38"/>
       <w:r>
         <w:t>Chapter 16 — Homeward</w:t>
@@ -39836,26 +39836,10 @@
     </w:p>
     <w:p>
       <w:pPr>
-        <w:pStyle w:val="BodyText"/>
-      </w:pPr>
-      <w:r>
-        <w:t>❦</w:t>
-      </w:r>
-    </w:p>
-    <w:p>
-      <w:pPr>
-        <w:pStyle w:val="BodyText"/>
-      </w:pPr>
-      <w:r>
-        <w:t>END ACT III</w:t>
-      </w:r>
-    </w:p>
-    <w:p>
-      <w:pPr>
         <w:pStyle w:val="Heading1"/>
       </w:pPr>
       <w:bookmarkStart w:id="42" w:name="chapter-17-the-listening-post"/>
-      <w:bookmarkStart w:id="43" w:name="_Toc234955051"/>
+      <w:bookmarkStart w:id="43" w:name="_Toc235544127"/>
       <w:bookmarkEnd w:id="40"/>
       <w:r>
         <w:t>Chapter 17 — The Listening Post</w:t>
@@ -41498,18 +41482,10 @@
     </w:p>
     <w:p>
       <w:pPr>
-        <w:pStyle w:val="BodyText"/>
-      </w:pPr>
-      <w:r>
-        <w:t>❦</w:t>
-      </w:r>
-    </w:p>
-    <w:p>
-      <w:pPr>
         <w:pStyle w:val="Heading1"/>
       </w:pPr>
       <w:bookmarkStart w:id="44" w:name="chapter-18-new-words"/>
-      <w:bookmarkStart w:id="45" w:name="_Toc234955052"/>
+      <w:bookmarkStart w:id="45" w:name="_Toc235544128"/>
       <w:bookmarkEnd w:id="42"/>
       <w:r>
         <w:t>Chapter 18 — New Words</w:t>
@@ -42806,18 +42782,10 @@
     </w:p>
     <w:p>
       <w:pPr>
-        <w:pStyle w:val="BodyText"/>
-      </w:pPr>
-      <w:r>
-        <w:t>❦</w:t>
-      </w:r>
-    </w:p>
-    <w:p>
-      <w:pPr>
         <w:pStyle w:val="Heading1"/>
       </w:pPr>
       <w:bookmarkStart w:id="46" w:name="archive-2"/>
-      <w:bookmarkStart w:id="47" w:name="_Toc234955053"/>
+      <w:bookmarkStart w:id="47" w:name="_Toc235544129"/>
       <w:bookmarkEnd w:id="44"/>
       <w:r>
         <w:t>Archive</w:t>
@@ -43009,7 +42977,7 @@
         <w:pStyle w:val="Heading1"/>
       </w:pPr>
       <w:bookmarkStart w:id="49" w:name="chapter-19-the-witnesses"/>
-      <w:bookmarkStart w:id="50" w:name="_Toc234955054"/>
+      <w:bookmarkStart w:id="50" w:name="_Toc235544130"/>
       <w:bookmarkEnd w:id="46"/>
       <w:bookmarkEnd w:id="48"/>
       <w:r>
@@ -44466,7 +44434,7 @@
         <w:pStyle w:val="Heading1"/>
       </w:pPr>
       <w:bookmarkStart w:id="51" w:name="chapter-20-the-long-shadow"/>
-      <w:bookmarkStart w:id="52" w:name="_Toc234955055"/>
+      <w:bookmarkStart w:id="52" w:name="_Toc235544131"/>
       <w:bookmarkEnd w:id="49"/>
       <w:r>
         <w:t>Chapter 20 — The Long Shadow</w:t>
@@ -45659,7 +45627,7 @@
         <w:pStyle w:val="Heading1"/>
       </w:pPr>
       <w:bookmarkStart w:id="53" w:name="chapter-21-the-first-doctrine"/>
-      <w:bookmarkStart w:id="54" w:name="_Toc234955056"/>
+      <w:bookmarkStart w:id="54" w:name="_Toc235544132"/>
       <w:bookmarkEnd w:id="51"/>
       <w:r>
         <w:t>Chapter 21 — The First Doctrine</w:t>
@@ -47608,7 +47576,7 @@
         <w:pStyle w:val="Heading1"/>
       </w:pPr>
       <w:bookmarkStart w:id="55" w:name="chapter-22-the-crossing"/>
-      <w:bookmarkStart w:id="56" w:name="_Toc234955057"/>
+      <w:bookmarkStart w:id="56" w:name="_Toc235544133"/>
       <w:bookmarkEnd w:id="53"/>
       <w:r>
         <w:t>Chapter 22 — The Crossing</w:t>
@@ -49110,7 +49078,7 @@
         <w:pStyle w:val="Heading1"/>
       </w:pPr>
       <w:bookmarkStart w:id="57" w:name="chapter-23-recognition"/>
-      <w:bookmarkStart w:id="58" w:name="_Toc234955058"/>
+      <w:bookmarkStart w:id="58" w:name="_Toc235544134"/>
       <w:bookmarkEnd w:id="55"/>
       <w:r>
         <w:t>Chapter 23 — Recognition</w:t>
@@ -50868,7 +50836,7 @@
         <w:pStyle w:val="Heading1"/>
       </w:pPr>
       <w:bookmarkStart w:id="59" w:name="chapter-24-after-contact"/>
-      <w:bookmarkStart w:id="60" w:name="_Toc234955059"/>
+      <w:bookmarkStart w:id="60" w:name="_Toc235544135"/>
       <w:bookmarkEnd w:id="57"/>
       <w:r>
         <w:t>Chapter 24 — After Contact</w:t>
@@ -52477,7 +52445,7 @@
         <w:pStyle w:val="Heading1"/>
       </w:pPr>
       <w:bookmarkStart w:id="61" w:name="epilogue-first-day"/>
-      <w:bookmarkStart w:id="62" w:name="_Toc234955060"/>
+      <w:bookmarkStart w:id="62" w:name="_Toc235544136"/>
       <w:bookmarkEnd w:id="59"/>
       <w:r>
         <w:t>Epilogue — First Day</w:t>
@@ -53534,7 +53502,7 @@
         <w:pStyle w:val="Heading1"/>
       </w:pPr>
       <w:bookmarkStart w:id="63" w:name="appendix-reference-supplement"/>
-      <w:bookmarkStart w:id="64" w:name="_Toc234955061"/>
+      <w:bookmarkStart w:id="64" w:name="_Toc235544137"/>
       <w:bookmarkEnd w:id="61"/>
       <w:r>
         <w:t>Appendix — Reference Supplement</w:t>
@@ -53649,7 +53617,7 @@
         <w:pStyle w:val="Heading1"/>
       </w:pPr>
       <w:bookmarkStart w:id="65" w:name="appendix-a-fleet-vessel-reference"/>
-      <w:bookmarkStart w:id="66" w:name="_Toc234955062"/>
+      <w:bookmarkStart w:id="66" w:name="_Toc235544138"/>
       <w:bookmarkEnd w:id="63"/>
       <w:r>
         <w:t>APPENDIX A — Fleet Vessel Reference</w:t>
@@ -54419,7 +54387,7 @@
         <w:pStyle w:val="Heading1"/>
       </w:pPr>
       <w:bookmarkStart w:id="74" w:name="appendix-b-personnel-reference"/>
-      <w:bookmarkStart w:id="75" w:name="_Toc234955063"/>
+      <w:bookmarkStart w:id="75" w:name="_Toc235544139"/>
       <w:bookmarkEnd w:id="65"/>
       <w:bookmarkEnd w:id="67"/>
       <w:bookmarkEnd w:id="73"/>
@@ -55554,10 +55522,10 @@
       <w:pPr>
         <w:pStyle w:val="Heading2"/>
       </w:pPr>
-      <w:bookmarkStart w:id="82" w:name="dr.-marcus-walsh-medical-crew-systems"/>
+      <w:bookmarkStart w:id="82" w:name="lena-walsh-medical-crew-systems"/>
       <w:bookmarkEnd w:id="81"/>
       <w:r>
-        <w:t>Dr. Marcus Walsh — Medical / Crew Systems</w:t>
+        <w:t>Lena Walsh — Medical / Crew Systems</w:t>
       </w:r>
     </w:p>
     <w:tbl>
@@ -55630,7 +55598,7 @@
               <w:pStyle w:val="Compact"/>
             </w:pPr>
             <w:r>
-              <w:t xml:space="preserve">Medical officer, </w:t>
+              <w:t xml:space="preserve">General support / medical &amp; crew systems, </w:t>
             </w:r>
             <w:r>
               <w:rPr>
@@ -55702,7 +55670,7 @@
         <w:t>Professional characterization:</w:t>
       </w:r>
       <w:r>
-        <w:t xml:space="preserve"> Practical; crew-facing realism; treats fatigue and injury as operational variables, not morale anecdotes.</w:t>
+        <w:t xml:space="preserve"> Practical; crew-facing realism; treats fatigue and injury as operational variables, not morale anecdotes. Notebook-first; quiet operational competence.</w:t>
       </w:r>
     </w:p>
     <w:p>
@@ -56003,7 +55971,7 @@
         <w:pStyle w:val="Heading1"/>
       </w:pPr>
       <w:bookmarkStart w:id="84" w:name="X6e8939eea15f18a9ddbffce39d3465e11cdb978"/>
-      <w:bookmarkStart w:id="85" w:name="_Toc234955064"/>
+      <w:bookmarkStart w:id="85" w:name="_Toc235544140"/>
       <w:bookmarkEnd w:id="74"/>
       <w:bookmarkEnd w:id="83"/>
       <w:r>
@@ -56501,7 +56469,7 @@
         <w:pStyle w:val="Heading1"/>
       </w:pPr>
       <w:bookmarkStart w:id="92" w:name="appendix-d-operational-terms"/>
-      <w:bookmarkStart w:id="93" w:name="_Toc234955065"/>
+      <w:bookmarkStart w:id="93" w:name="_Toc235544141"/>
       <w:bookmarkEnd w:id="84"/>
       <w:bookmarkEnd w:id="88"/>
       <w:bookmarkEnd w:id="91"/>
@@ -57187,7 +57155,7 @@
         <w:pStyle w:val="Heading1"/>
       </w:pPr>
       <w:bookmarkStart w:id="101" w:name="appendix-e-historical-timeline"/>
-      <w:bookmarkStart w:id="102" w:name="_Toc234955066"/>
+      <w:bookmarkStart w:id="102" w:name="_Toc235544142"/>
       <w:bookmarkEnd w:id="92"/>
       <w:bookmarkEnd w:id="100"/>
       <w:r>
@@ -57703,7 +57671,7 @@
         <w:pStyle w:val="Heading1"/>
       </w:pPr>
       <w:bookmarkStart w:id="103" w:name="appendix-f-fleet-operational-chart"/>
-      <w:bookmarkStart w:id="104" w:name="_Toc234955067"/>
+      <w:bookmarkStart w:id="104" w:name="_Toc235544143"/>
       <w:bookmarkEnd w:id="101"/>
       <w:r>
         <w:t>APPENDIX F — Fleet Operational Chart</w:t>
@@ -57778,30 +57746,10 @@
     </w:p>
     <w:p>
       <w:pPr>
-        <w:pStyle w:val="BodyText"/>
-      </w:pPr>
-      <w:r>
-        <w:t>❦</w:t>
-      </w:r>
-    </w:p>
-    <w:p>
-      <w:pPr>
-        <w:pStyle w:val="BodyText"/>
-      </w:pPr>
-      <w:r>
-        <w:rPr>
-          <w:i/>
-          <w:iCs/>
-        </w:rPr>
-        <w:t>END APPENDIX</w:t>
-      </w:r>
-    </w:p>
-    <w:p>
-      <w:pPr>
         <w:pStyle w:val="Heading1"/>
       </w:pPr>
       <w:bookmarkStart w:id="105" w:name="about-the-author"/>
-      <w:bookmarkStart w:id="106" w:name="_Toc234955068"/>
+      <w:bookmarkStart w:id="106" w:name="_Toc235544144"/>
       <w:bookmarkEnd w:id="103"/>
       <w:r>
         <w:t>About the Author</w:t>
@@ -58023,7 +57971,7 @@
   <w:abstractNum w:abstractNumId="0" w15:restartNumberingAfterBreak="0">
     <w:nsid w:val="0000A990"/>
     <w:multiLevelType w:val="multilevel"/>
-    <w:tmpl w:val="2BAE1E9E"/>
+    <w:tmpl w:val="0D001828"/>
     <w:lvl w:ilvl="0">
       <w:numFmt w:val="bullet"/>
       <w:lvlText w:val=" "/>
@@ -58100,7 +58048,7 @@
   <w:abstractNum w:abstractNumId="1" w15:restartNumberingAfterBreak="0">
     <w:nsid w:val="0000A991"/>
     <w:multiLevelType w:val="multilevel"/>
-    <w:tmpl w:val="4202C8DC"/>
+    <w:tmpl w:val="E6448546"/>
     <w:lvl w:ilvl="0">
       <w:numFmt w:val="bullet"/>
       <w:lvlText w:val=""/>
@@ -58201,67 +58149,67 @@
       </w:rPr>
     </w:lvl>
   </w:abstractNum>
-  <w:num w:numId="1" w16cid:durableId="1347364556">
+  <w:num w:numId="1" w16cid:durableId="929967717">
     <w:abstractNumId w:val="0"/>
   </w:num>
-  <w:num w:numId="2" w16cid:durableId="917979803">
+  <w:num w:numId="2" w16cid:durableId="905727619">
     <w:abstractNumId w:val="1"/>
   </w:num>
-  <w:num w:numId="3" w16cid:durableId="766074520">
+  <w:num w:numId="3" w16cid:durableId="1821535604">
     <w:abstractNumId w:val="1"/>
   </w:num>
-  <w:num w:numId="4" w16cid:durableId="1329091761">
+  <w:num w:numId="4" w16cid:durableId="1251426501">
     <w:abstractNumId w:val="1"/>
   </w:num>
-  <w:num w:numId="5" w16cid:durableId="973560503">
+  <w:num w:numId="5" w16cid:durableId="58527240">
     <w:abstractNumId w:val="1"/>
   </w:num>
-  <w:num w:numId="6" w16cid:durableId="1320690461">
+  <w:num w:numId="6" w16cid:durableId="2098941199">
     <w:abstractNumId w:val="1"/>
   </w:num>
-  <w:num w:numId="7" w16cid:durableId="571232597">
+  <w:num w:numId="7" w16cid:durableId="542644775">
     <w:abstractNumId w:val="1"/>
   </w:num>
-  <w:num w:numId="8" w16cid:durableId="1676223536">
+  <w:num w:numId="8" w16cid:durableId="1363820391">
     <w:abstractNumId w:val="1"/>
   </w:num>
-  <w:num w:numId="9" w16cid:durableId="595094410">
+  <w:num w:numId="9" w16cid:durableId="609163771">
     <w:abstractNumId w:val="1"/>
   </w:num>
-  <w:num w:numId="10" w16cid:durableId="521666691">
+  <w:num w:numId="10" w16cid:durableId="1754886804">
     <w:abstractNumId w:val="1"/>
   </w:num>
-  <w:num w:numId="11" w16cid:durableId="828714833">
+  <w:num w:numId="11" w16cid:durableId="424765581">
     <w:abstractNumId w:val="1"/>
   </w:num>
-  <w:num w:numId="12" w16cid:durableId="1838034834">
+  <w:num w:numId="12" w16cid:durableId="545339572">
     <w:abstractNumId w:val="1"/>
   </w:num>
-  <w:num w:numId="13" w16cid:durableId="1679699470">
+  <w:num w:numId="13" w16cid:durableId="1625456288">
     <w:abstractNumId w:val="1"/>
   </w:num>
-  <w:num w:numId="14" w16cid:durableId="1641769300">
+  <w:num w:numId="14" w16cid:durableId="889807497">
     <w:abstractNumId w:val="1"/>
   </w:num>
-  <w:num w:numId="15" w16cid:durableId="1395547433">
+  <w:num w:numId="15" w16cid:durableId="983923363">
     <w:abstractNumId w:val="1"/>
   </w:num>
-  <w:num w:numId="16" w16cid:durableId="563176378">
+  <w:num w:numId="16" w16cid:durableId="1790278556">
     <w:abstractNumId w:val="1"/>
   </w:num>
-  <w:num w:numId="17" w16cid:durableId="484514427">
+  <w:num w:numId="17" w16cid:durableId="2011902857">
     <w:abstractNumId w:val="1"/>
   </w:num>
-  <w:num w:numId="18" w16cid:durableId="433012086">
+  <w:num w:numId="18" w16cid:durableId="1497266679">
     <w:abstractNumId w:val="1"/>
   </w:num>
-  <w:num w:numId="19" w16cid:durableId="1686401439">
+  <w:num w:numId="19" w16cid:durableId="1378625391">
     <w:abstractNumId w:val="1"/>
   </w:num>
-  <w:num w:numId="20" w16cid:durableId="156849034">
+  <w:num w:numId="20" w16cid:durableId="957953846">
     <w:abstractNumId w:val="1"/>
   </w:num>
-  <w:num w:numId="21" w16cid:durableId="1507284219">
+  <w:num w:numId="21" w16cid:durableId="1462382391">
     <w:abstractNumId w:val="1"/>
   </w:num>
 </w:numbering>
@@ -59500,7 +59448,7 @@
     <w:next w:val="Normal"/>
     <w:autoRedefine/>
     <w:uiPriority w:val="39"/>
-    <w:rsid w:val="00441311"/>
+    <w:rsid w:val="00534D3E"/>
     <w:pPr>
       <w:spacing w:after="100"/>
     </w:pPr>
@@ -59509,7 +59457,7 @@
     <w:name w:val="header"/>
     <w:basedOn w:val="Normal"/>
     <w:link w:val="HeaderChar"/>
-    <w:rsid w:val="00441311"/>
+    <w:rsid w:val="00534D3E"/>
     <w:pPr>
       <w:tabs>
         <w:tab w:val="center" w:pos="4680"/>
@@ -59522,7 +59470,7 @@
     <w:name w:val="Header Char"/>
     <w:basedOn w:val="DefaultParagraphFont"/>
     <w:link w:val="Header"/>
-    <w:rsid w:val="00441311"/>
+    <w:rsid w:val="00534D3E"/>
     <w:rPr>
       <w:rFonts w:ascii="Times New Roman" w:hAnsi="Times New Roman" w:cs="Times New Roman"/>
     </w:rPr>
@@ -59531,7 +59479,7 @@
     <w:name w:val="footer"/>
     <w:basedOn w:val="Normal"/>
     <w:link w:val="FooterChar"/>
-    <w:rsid w:val="00441311"/>
+    <w:rsid w:val="00534D3E"/>
     <w:pPr>
       <w:tabs>
         <w:tab w:val="center" w:pos="4680"/>
@@ -59544,7 +59492,7 @@
     <w:name w:val="Footer Char"/>
     <w:basedOn w:val="DefaultParagraphFont"/>
     <w:link w:val="Footer"/>
-    <w:rsid w:val="00441311"/>
+    <w:rsid w:val="00534D3E"/>
     <w:rPr>
       <w:rFonts w:ascii="Times New Roman" w:hAnsi="Times New Roman" w:cs="Times New Roman"/>
     </w:rPr>

</xml_diff>